<commit_message>
Revise the programme summary and record the funnel measurement
The click-through number the owner asked for did not exist: the GET
served the question set and logged nothing, so the earliest visible
event was a completed submission.

Summary gains sections on the optional exchange and on measurement, the
row table extended from two to three, and the open item rewritten so a
zero reads as the expected state rather than a measured result.

Co-Authored-By: Claude Opus 5 <noreply@anthropic.com>
Claude-Session: https://claude.ai/code/session_01W9UtE7X76spacWeSvBH7tv
</commit_message>
<xml_diff>
--- a/research/Reviewer_Program_Summary_2026-08-09.docx
+++ b/research/Reviewer_Program_Summary_2026-08-09.docx
@@ -19,7 +19,7 @@
         <w:rPr>
           <w:b/>
         </w:rPr>
-        <w:t xml:space="preserve">2026-08-09. Live at https://jrsstandard.com/reviewer</w:t>
+        <w:t xml:space="preserve">Revised 2026-08-10. Live at https://jrsstandard.com/reviewer</w:t>
       </w:r>
     </w:p>
     <w:p>
@@ -328,6 +328,14 @@
     </w:p>
     <w:p>
       <w:pPr>
+        <w:spacing w:after="140"/>
+      </w:pPr>
+      <w:r>
+        <w:t xml:space="preserve">There is also an optional exchange offered at the end of the evaluation, described in the next section, which does not require the training or the certificate.</w:t>
+      </w:r>
+    </w:p>
+    <w:p>
+      <w:pPr>
         <w:pStyle w:val="Heading2"/>
         <w:spacing w:after="140"/>
       </w:pPr>
@@ -847,10 +855,625 @@
     </w:p>
     <w:p>
       <w:pPr>
+        <w:pBdr>
+          <w:bottom w:val="single" w:sz="6" w:space="1" w:color="AAAAAA"/>
+        </w:pBdr>
+      </w:pPr>
+    </w:p>
+    <w:p>
+      <w:pPr>
         <w:pStyle w:val="Heading2"/>
         <w:spacing w:after="140"/>
       </w:pPr>
       <w:r>
+        <w:t xml:space="preserve">The optional exchange: LinkedIn Peer Reviewer Recommendation</w:t>
+      </w:r>
+    </w:p>
+    <w:p>
+      <w:pPr>
+        <w:spacing w:after="140"/>
+      </w:pPr>
+      <w:r>
+        <w:t xml:space="preserve">At the foot of the evaluation, above the submit button, sits one optional tick:</w:t>
+      </w:r>
+    </w:p>
+    <w:p>
+      <w:pPr>
+        <w:spacing w:after="140"/>
+      </w:pPr>
+      <w:r>
+        <w:t xml:space="preserve">&gt; Request a </w:t>
+      </w:r>
+      <w:r>
+        <w:rPr>
+          <w:b/>
+        </w:rPr>
+        <w:t xml:space="preserve">LinkedIn Peer Reviewer Recommendation</w:t>
+      </w:r>
+      <w:r>
+        <w:t xml:space="preserve"> for contributing to this research baseline.</w:t>
+      </w:r>
+    </w:p>
+    <w:p>
+      <w:pPr>
+        <w:spacing w:after="140"/>
+      </w:pPr>
+      <w:r>
+        <w:t xml:space="preserve">Ticking it reveals three fields: full name, work email, LinkedIn profile URL. Beneath them:</w:t>
+      </w:r>
+    </w:p>
+    <w:p>
+      <w:pPr>
+        <w:spacing w:after="140"/>
+      </w:pPr>
+      <w:r>
+        <w:t xml:space="preserve">&gt; By checking this box, you consent to research follow-up and secure storage and transfer of your contact information if JRS assets are transferred to a successor project.</w:t>
+      </w:r>
+    </w:p>
+    <w:p>
+      <w:pPr>
+        <w:spacing w:after="140"/>
+      </w:pPr>
+      <w:r>
+        <w:rPr>
+          <w:b/>
+        </w:rPr>
+        <w:t xml:space="preserve">Why it exists.</w:t>
+      </w:r>
+      <w:r>
+        <w:t xml:space="preserve"> Before this, an evaluation submitted with the certificate box unticked produced one row of anonymous answers and no contact record at all. That is a market data point with no </w:t>
+      </w:r>
+      <w:r>
+        <w:rPr>
+          <w:rFonts w:ascii="Consolas" w:hAnsi="Consolas"/>
+        </w:rPr>
+        <w:t xml:space="preserve">consent_transfer</w:t>
+      </w:r>
+      <w:r>
+        <w:t xml:space="preserve">, and </w:t>
+      </w:r>
+      <w:r>
+        <w:rPr>
+          <w:rFonts w:ascii="Consolas" w:hAnsi="Consolas"/>
+        </w:rPr>
+        <w:t xml:space="preserve">consent_transfer</w:t>
+      </w:r>
+      <w:r>
+        <w:t xml:space="preserve"> is the field that makes a contact record travel with the assets rather than being a list that dies with the seller. The recommendation is the exchange that converts an anonymous respondent into a transferable contact.</w:t>
+      </w:r>
+    </w:p>
+    <w:p>
+      <w:pPr>
+        <w:spacing w:after="140"/>
+      </w:pPr>
+      <w:r>
+        <w:rPr>
+          <w:b/>
+        </w:rPr>
+        <w:t xml:space="preserve">What the recommendation says, and what it does not.</w:t>
+      </w:r>
+      <w:r>
+        <w:t xml:space="preserve"> It is offered for the contribution to the research baseline. The page states in the same block that it does not assert anything about the person's professional performance, which has not been observed. A recommendation claiming otherwise would be an endorsement written about work nobody saw, and the first person to notice would be whoever reads it on their profile.</w:t>
+      </w:r>
+    </w:p>
+    <w:p>
+      <w:pPr>
+        <w:spacing w:after="140"/>
+      </w:pPr>
+      <w:r>
+        <w:rPr>
+          <w:b/>
+        </w:rPr>
+        <w:t xml:space="preserve">The LinkedIn field is not stored as typed.</w:t>
+      </w:r>
+      <w:r>
+        <w:t xml:space="preserve"> A URL field that later renders in any dashboard is an injection surface. Input passes a host allowlist: a bare handle normalises to </w:t>
+      </w:r>
+      <w:r>
+        <w:rPr>
+          <w:rFonts w:ascii="Consolas" w:hAnsi="Consolas"/>
+        </w:rPr>
+        <w:t xml:space="preserve">linkedin.com/in/</w:t>
+      </w:r>
+      <w:r>
+        <w:t xml:space="preserve">, a bare domain gains the scheme, a regional subdomain keeps its own host, and anything that is not a LinkedIn host or contains a quote, angle bracket or backslash is dropped rather than stored.</w:t>
+      </w:r>
+    </w:p>
+    <w:p>
+      <w:pPr>
+        <w:pBdr>
+          <w:bottom w:val="single" w:sz="6" w:space="1" w:color="AAAAAA"/>
+        </w:pBdr>
+      </w:pPr>
+    </w:p>
+    <w:p>
+      <w:pPr>
+        <w:pStyle w:val="Heading2"/>
+        <w:spacing w:after="140"/>
+      </w:pPr>
+      <w:r>
+        <w:t xml:space="preserve">Measurement: opened, submitted, completed, captured</w:t>
+      </w:r>
+    </w:p>
+    <w:p>
+      <w:pPr>
+        <w:spacing w:after="140"/>
+      </w:pPr>
+      <w:r>
+        <w:t xml:space="preserve">Four numbers, answering four different questions that were previously collapsed into one. All live at </w:t>
+      </w:r>
+      <w:r>
+        <w:rPr>
+          <w:rFonts w:ascii="Consolas" w:hAnsi="Consolas"/>
+        </w:rPr>
+        <w:t xml:space="preserve">https://jrsstandard.com/api/asset-stats</w:t>
+      </w:r>
+      <w:r>
+        <w:t xml:space="preserve"> under </w:t>
+      </w:r>
+      <w:r>
+        <w:rPr>
+          <w:rFonts w:ascii="Consolas" w:hAnsi="Consolas"/>
+        </w:rPr>
+        <w:t xml:space="preserve">reviewer_evaluation_funnel</w:t>
+      </w:r>
+      <w:r>
+        <w:t xml:space="preserve">.</w:t>
+      </w:r>
+    </w:p>
+    <w:tbl>
+      <w:tblPr>
+        <w:tblStyle w:val="TableGrid"/>
+        <w:tblW w:w="9360" w:type="dxa"/>
+        <w:tblBorders>
+          <w:top w:val="single" w:sz="4" w:space="0" w:color="999999"/>
+          <w:left w:val="single" w:sz="4" w:space="0" w:color="999999"/>
+          <w:bottom w:val="single" w:sz="4" w:space="0" w:color="999999"/>
+          <w:right w:val="single" w:sz="4" w:space="0" w:color="999999"/>
+          <w:insideH w:val="single" w:sz="4" w:space="0" w:color="999999"/>
+          <w:insideV w:val="single" w:sz="4" w:space="0" w:color="999999"/>
+        </w:tblBorders>
+      </w:tblPr>
+      <w:tblGrid>
+        <w:gridCol w:w="4680"/>
+        <w:gridCol w:w="4680"/>
+      </w:tblGrid>
+      <w:tr>
+        <w:tc>
+          <w:tcPr>
+            <w:tcW w:w="4680" w:type="dxa"/>
+          </w:tcPr>
+          <w:p>
+            <w:pPr>
+              <w:spacing w:after="0"/>
+            </w:pPr>
+            <w:r>
+              <w:t xml:space="preserve">Metric</w:t>
+            </w:r>
+          </w:p>
+        </w:tc>
+        <w:tc>
+          <w:tcPr>
+            <w:tcW w:w="4680" w:type="dxa"/>
+          </w:tcPr>
+          <w:p>
+            <w:pPr>
+              <w:spacing w:after="0"/>
+            </w:pPr>
+            <w:r>
+              <w:t xml:space="preserve">What it counts</w:t>
+            </w:r>
+          </w:p>
+        </w:tc>
+      </w:tr>
+      <w:tr>
+        <w:tc>
+          <w:tcPr>
+            <w:tcW w:w="4680" w:type="dxa"/>
+          </w:tcPr>
+          <w:p>
+            <w:pPr>
+              <w:spacing w:after="0"/>
+            </w:pPr>
+            <w:r>
+              <w:rPr>
+                <w:rFonts w:ascii="Consolas" w:hAnsi="Consolas"/>
+              </w:rPr>
+              <w:t xml:space="preserve">opened</w:t>
+            </w:r>
+          </w:p>
+        </w:tc>
+        <w:tc>
+          <w:tcPr>
+            <w:tcW w:w="4680" w:type="dxa"/>
+          </w:tcPr>
+          <w:p>
+            <w:pPr>
+              <w:spacing w:after="0"/>
+            </w:pPr>
+            <w:r>
+              <w:t xml:space="preserve">People who clicked through to the evaluation</w:t>
+            </w:r>
+          </w:p>
+        </w:tc>
+      </w:tr>
+      <w:tr>
+        <w:tc>
+          <w:tcPr>
+            <w:tcW w:w="4680" w:type="dxa"/>
+          </w:tcPr>
+          <w:p>
+            <w:pPr>
+              <w:spacing w:after="0"/>
+            </w:pPr>
+            <w:r>
+              <w:rPr>
+                <w:rFonts w:ascii="Consolas" w:hAnsi="Consolas"/>
+              </w:rPr>
+              <w:t xml:space="preserve">submitted</w:t>
+            </w:r>
+          </w:p>
+        </w:tc>
+        <w:tc>
+          <w:tcPr>
+            <w:tcW w:w="4680" w:type="dxa"/>
+          </w:tcPr>
+          <w:p>
+            <w:pPr>
+              <w:spacing w:after="0"/>
+            </w:pPr>
+            <w:r>
+              <w:t xml:space="preserve">Submissions with at least one answer</w:t>
+            </w:r>
+          </w:p>
+        </w:tc>
+      </w:tr>
+      <w:tr>
+        <w:tc>
+          <w:tcPr>
+            <w:tcW w:w="4680" w:type="dxa"/>
+          </w:tcPr>
+          <w:p>
+            <w:pPr>
+              <w:spacing w:after="0"/>
+            </w:pPr>
+            <w:r>
+              <w:rPr>
+                <w:rFonts w:ascii="Consolas" w:hAnsi="Consolas"/>
+              </w:rPr>
+              <w:t xml:space="preserve">completed_all_questions</w:t>
+            </w:r>
+          </w:p>
+        </w:tc>
+        <w:tc>
+          <w:tcPr>
+            <w:tcW w:w="4680" w:type="dxa"/>
+          </w:tcPr>
+          <w:p>
+            <w:pPr>
+              <w:spacing w:after="0"/>
+            </w:pPr>
+            <w:r>
+              <w:t xml:space="preserve">Submissions answering all nine</w:t>
+            </w:r>
+          </w:p>
+        </w:tc>
+      </w:tr>
+      <w:tr>
+        <w:tc>
+          <w:tcPr>
+            <w:tcW w:w="4680" w:type="dxa"/>
+          </w:tcPr>
+          <w:p>
+            <w:pPr>
+              <w:spacing w:after="0"/>
+            </w:pPr>
+            <w:r>
+              <w:rPr>
+                <w:rFonts w:ascii="Consolas" w:hAnsi="Consolas"/>
+              </w:rPr>
+              <w:t xml:space="preserve">mean_questions_answered</w:t>
+            </w:r>
+          </w:p>
+        </w:tc>
+        <w:tc>
+          <w:tcPr>
+            <w:tcW w:w="4680" w:type="dxa"/>
+          </w:tcPr>
+          <w:p>
+            <w:pPr>
+              <w:spacing w:after="0"/>
+            </w:pPr>
+            <w:r>
+              <w:t xml:space="preserve">Average answered per submission</w:t>
+            </w:r>
+          </w:p>
+        </w:tc>
+      </w:tr>
+      <w:tr>
+        <w:tc>
+          <w:tcPr>
+            <w:tcW w:w="4680" w:type="dxa"/>
+          </w:tcPr>
+          <w:p>
+            <w:pPr>
+              <w:spacing w:after="0"/>
+            </w:pPr>
+            <w:r>
+              <w:rPr>
+                <w:rFonts w:ascii="Consolas" w:hAnsi="Consolas"/>
+              </w:rPr>
+              <w:t xml:space="preserve">contacts_captured</w:t>
+            </w:r>
+          </w:p>
+        </w:tc>
+        <w:tc>
+          <w:tcPr>
+            <w:tcW w:w="4680" w:type="dxa"/>
+          </w:tcPr>
+          <w:p>
+            <w:pPr>
+              <w:spacing w:after="0"/>
+            </w:pPr>
+            <w:r>
+              <w:t xml:space="preserve">Transferable contact records produced</w:t>
+            </w:r>
+          </w:p>
+        </w:tc>
+      </w:tr>
+      <w:tr>
+        <w:tc>
+          <w:tcPr>
+            <w:tcW w:w="4680" w:type="dxa"/>
+          </w:tcPr>
+          <w:p>
+            <w:pPr>
+              <w:spacing w:after="0"/>
+            </w:pPr>
+            <w:r>
+              <w:rPr>
+                <w:rFonts w:ascii="Consolas" w:hAnsi="Consolas"/>
+              </w:rPr>
+              <w:t xml:space="preserve">contacts_via_recommendation</w:t>
+            </w:r>
+          </w:p>
+        </w:tc>
+        <w:tc>
+          <w:tcPr>
+            <w:tcW w:w="4680" w:type="dxa"/>
+          </w:tcPr>
+          <w:p>
+            <w:pPr>
+              <w:spacing w:after="0"/>
+            </w:pPr>
+            <w:r>
+              <w:t xml:space="preserve">Of those, from the incentive block</w:t>
+            </w:r>
+          </w:p>
+        </w:tc>
+      </w:tr>
+      <w:tr>
+        <w:tc>
+          <w:tcPr>
+            <w:tcW w:w="4680" w:type="dxa"/>
+          </w:tcPr>
+          <w:p>
+            <w:pPr>
+              <w:spacing w:after="0"/>
+            </w:pPr>
+            <w:r>
+              <w:rPr>
+                <w:rFonts w:ascii="Consolas" w:hAnsi="Consolas"/>
+              </w:rPr>
+              <w:t xml:space="preserve">contacts_via_certificate</w:t>
+            </w:r>
+          </w:p>
+        </w:tc>
+        <w:tc>
+          <w:tcPr>
+            <w:tcW w:w="4680" w:type="dxa"/>
+          </w:tcPr>
+          <w:p>
+            <w:pPr>
+              <w:spacing w:after="0"/>
+            </w:pPr>
+            <w:r>
+              <w:t xml:space="preserve">Of those, from the certificate tick</w:t>
+            </w:r>
+          </w:p>
+        </w:tc>
+      </w:tr>
+      <w:tr>
+        <w:tc>
+          <w:tcPr>
+            <w:tcW w:w="4680" w:type="dxa"/>
+          </w:tcPr>
+          <w:p>
+            <w:pPr>
+              <w:spacing w:after="0"/>
+            </w:pPr>
+            <w:r>
+              <w:rPr>
+                <w:rFonts w:ascii="Consolas" w:hAnsi="Consolas"/>
+              </w:rPr>
+              <w:t xml:space="preserve">open_to_submit_pct</w:t>
+            </w:r>
+          </w:p>
+        </w:tc>
+        <w:tc>
+          <w:tcPr>
+            <w:tcW w:w="4680" w:type="dxa"/>
+          </w:tcPr>
+          <w:p>
+            <w:pPr>
+              <w:spacing w:after="0"/>
+            </w:pPr>
+            <w:r>
+              <w:t xml:space="preserve">Did they start and finish?</w:t>
+            </w:r>
+          </w:p>
+        </w:tc>
+      </w:tr>
+      <w:tr>
+        <w:tc>
+          <w:tcPr>
+            <w:tcW w:w="4680" w:type="dxa"/>
+          </w:tcPr>
+          <w:p>
+            <w:pPr>
+              <w:spacing w:after="0"/>
+            </w:pPr>
+            <w:r>
+              <w:rPr>
+                <w:rFonts w:ascii="Consolas" w:hAnsi="Consolas"/>
+              </w:rPr>
+              <w:t xml:space="preserve">submit_to_contact_pct</w:t>
+            </w:r>
+          </w:p>
+        </w:tc>
+        <w:tc>
+          <w:tcPr>
+            <w:tcW w:w="4680" w:type="dxa"/>
+          </w:tcPr>
+          <w:p>
+            <w:pPr>
+              <w:spacing w:after="0"/>
+            </w:pPr>
+            <w:r>
+              <w:t xml:space="preserve">Did a respondent give details?</w:t>
+            </w:r>
+          </w:p>
+        </w:tc>
+      </w:tr>
+      <w:tr>
+        <w:tc>
+          <w:tcPr>
+            <w:tcW w:w="4680" w:type="dxa"/>
+          </w:tcPr>
+          <w:p>
+            <w:pPr>
+              <w:spacing w:after="0"/>
+            </w:pPr>
+            <w:r>
+              <w:rPr>
+                <w:rFonts w:ascii="Consolas" w:hAnsi="Consolas"/>
+              </w:rPr>
+              <w:t xml:space="preserve">open_to_contact_pct</w:t>
+            </w:r>
+          </w:p>
+        </w:tc>
+        <w:tc>
+          <w:tcPr>
+            <w:tcW w:w="4680" w:type="dxa"/>
+          </w:tcPr>
+          <w:p>
+            <w:pPr>
+              <w:spacing w:after="0"/>
+            </w:pPr>
+            <w:r>
+              <w:t xml:space="preserve">End-to-end yield from a click</w:t>
+            </w:r>
+          </w:p>
+        </w:tc>
+      </w:tr>
+    </w:tbl>
+    <w:p>
+      <w:pPr/>
+      <w:r>
+        <w:t/>
+      </w:r>
+    </w:p>
+    <w:p>
+      <w:pPr>
+        <w:spacing w:after="140"/>
+      </w:pPr>
+      <w:r>
+        <w:rPr>
+          <w:b/>
+        </w:rPr>
+        <w:t xml:space="preserve">The open count was not being recorded until 2026-08-10.</w:t>
+      </w:r>
+      <w:r>
+        <w:t xml:space="preserve"> The endpoint served the question set on a GET and logged nothing, so the first event the system could see was a completed submission: a page nobody finished and a page nobody opened were indistinguishable. The GET now writes an </w:t>
+      </w:r>
+      <w:r>
+        <w:rPr>
+          <w:rFonts w:ascii="Consolas" w:hAnsi="Consolas"/>
+        </w:rPr>
+        <w:t xml:space="preserve">eval-view</w:t>
+      </w:r>
+      <w:r>
+        <w:t xml:space="preserve"> row carrying the source tag, country and device, guarded against deploy checks and owner previews.</w:t>
+      </w:r>
+    </w:p>
+    <w:p>
+      <w:pPr>
+        <w:spacing w:after="140"/>
+      </w:pPr>
+      <w:r>
+        <w:rPr>
+          <w:b/>
+        </w:rPr>
+        <w:t xml:space="preserve">`opened` counts page opens, not distinct people.</w:t>
+      </w:r>
+      <w:r>
+        <w:t xml:space="preserve"> The evaluation page carries no per-person key, and inventing one would mean fingerprinting the reader, which the rest of this system deliberately does not do. That is stated inside the endpoint response rather than left for a reader to assume.</w:t>
+      </w:r>
+    </w:p>
+    <w:p>
+      <w:pPr>
+        <w:spacing w:after="140"/>
+      </w:pPr>
+      <w:r>
+        <w:rPr>
+          <w:b/>
+        </w:rPr>
+        <w:t xml:space="preserve">Source attribution.</w:t>
+      </w:r>
+      <w:r>
+        <w:t xml:space="preserve"> Any link can carry </w:t>
+      </w:r>
+      <w:r>
+        <w:rPr>
+          <w:rFonts w:ascii="Consolas" w:hAnsi="Consolas"/>
+        </w:rPr>
+        <w:t xml:space="preserve">?src=</w:t>
+      </w:r>
+      <w:r>
+        <w:t xml:space="preserve">, and the page passes it through to the open event, so </w:t>
+      </w:r>
+      <w:r>
+        <w:rPr>
+          <w:rFonts w:ascii="Consolas" w:hAnsi="Consolas"/>
+        </w:rPr>
+        <w:t xml:space="preserve">?src=linkedin</w:t>
+      </w:r>
+      <w:r>
+        <w:t xml:space="preserve"> and </w:t>
+      </w:r>
+      <w:r>
+        <w:rPr>
+          <w:rFonts w:ascii="Consolas" w:hAnsi="Consolas"/>
+        </w:rPr>
+        <w:t xml:space="preserve">?src=email</w:t>
+      </w:r>
+      <w:r>
+        <w:t xml:space="preserve"> are separable in the funnel. An untagged link is counted but not attributed.</w:t>
+      </w:r>
+    </w:p>
+    <w:p>
+      <w:pPr>
+        <w:pBdr>
+          <w:bottom w:val="single" w:sz="6" w:space="1" w:color="AAAAAA"/>
+        </w:pBdr>
+      </w:pPr>
+    </w:p>
+    <w:p>
+      <w:pPr>
+        <w:pStyle w:val="Heading2"/>
+        <w:spacing w:after="140"/>
+      </w:pPr>
+      <w:r>
         <w:t xml:space="preserve">Two unlinked rows: the design decision the whole instrument rests on</w:t>
       </w:r>
     </w:p>
@@ -859,13 +1482,13 @@
         <w:spacing w:after="140"/>
       </w:pPr>
       <w:r>
-        <w:t xml:space="preserve">Every submission writes </w:t>
+        <w:t xml:space="preserve">A submission writes up to </w:t>
       </w:r>
       <w:r>
         <w:rPr>
           <w:b/>
         </w:rPr>
-        <w:t xml:space="preserve">two separate records that share nothing linking them</w:t>
+        <w:t xml:space="preserve">three separate records that share nothing linking them</w:t>
       </w:r>
       <w:r>
         <w:t xml:space="preserve">.</w:t>
@@ -1076,11 +1699,85 @@
           </w:p>
         </w:tc>
       </w:tr>
+      <w:tr>
+        <w:tc>
+          <w:tcPr>
+            <w:tcW w:w="2340" w:type="dxa"/>
+          </w:tcPr>
+          <w:p>
+            <w:pPr>
+              <w:spacing w:after="0"/>
+            </w:pPr>
+            <w:r>
+              <w:t xml:space="preserve">Recommendation</w:t>
+            </w:r>
+          </w:p>
+        </w:tc>
+        <w:tc>
+          <w:tcPr>
+            <w:tcW w:w="2340" w:type="dxa"/>
+          </w:tcPr>
+          <w:p>
+            <w:pPr>
+              <w:spacing w:after="0"/>
+            </w:pPr>
+            <w:r>
+              <w:rPr>
+                <w:rFonts w:ascii="Consolas" w:hAnsi="Consolas"/>
+              </w:rPr>
+              <w:t xml:space="preserve">pilot_contacts</w:t>
+            </w:r>
+            <w:r>
+              <w:t xml:space="preserve">, source </w:t>
+            </w:r>
+            <w:r>
+              <w:rPr>
+                <w:rFonts w:ascii="Consolas" w:hAnsi="Consolas"/>
+              </w:rPr>
+              <w:t xml:space="preserve">reviewer-eval-incentive</w:t>
+            </w:r>
+          </w:p>
+        </w:tc>
+        <w:tc>
+          <w:tcPr>
+            <w:tcW w:w="2340" w:type="dxa"/>
+          </w:tcPr>
+          <w:p>
+            <w:pPr>
+              <w:spacing w:after="0"/>
+            </w:pPr>
+            <w:r>
+              <w:t xml:space="preserve">Name, work email, LinkedIn URL, consent flags</w:t>
+            </w:r>
+          </w:p>
+        </w:tc>
+        <w:tc>
+          <w:tcPr>
+            <w:tcW w:w="2340" w:type="dxa"/>
+          </w:tcPr>
+          <w:p>
+            <w:pPr>
+              <w:spacing w:after="0"/>
+            </w:pPr>
+            <w:r>
+              <w:t xml:space="preserve">Any answer, and no completion code, no evaluation id, no sector, size or role</w:t>
+            </w:r>
+          </w:p>
+        </w:tc>
+      </w:tr>
     </w:tbl>
     <w:p>
       <w:pPr/>
       <w:r>
         <w:t/>
+      </w:r>
+    </w:p>
+    <w:p>
+      <w:pPr>
+        <w:spacing w:after="140"/>
+      </w:pPr>
+      <w:r>
+        <w:t xml:space="preserve">Isolation is enforced by omission rather than by a filter: the incentive payload contains no value that also appears on the evaluation row, so there is no foreign key, join key or shared identifier of any kind. The only thing the rows have in common is a coarse timestamp, and a timestamp shared by every submission in the same minute is not an identifier.</w:t>
       </w:r>
     </w:p>
     <w:p>
@@ -1418,6 +2115,72 @@
               <w:spacing w:after="0"/>
             </w:pPr>
             <w:r>
+              <w:t xml:space="preserve">Recommendation request</w:t>
+            </w:r>
+          </w:p>
+        </w:tc>
+        <w:tc>
+          <w:tcPr>
+            <w:tcW w:w="2340" w:type="dxa"/>
+          </w:tcPr>
+          <w:p>
+            <w:pPr>
+              <w:spacing w:after="0"/>
+            </w:pPr>
+            <w:r>
+              <w:rPr>
+                <w:rFonts w:ascii="Consolas" w:hAnsi="Consolas"/>
+              </w:rPr>
+              <w:t xml:space="preserve">pilot_contacts</w:t>
+            </w:r>
+            <w:r>
+              <w:t xml:space="preserve">, source </w:t>
+            </w:r>
+            <w:r>
+              <w:rPr>
+                <w:rFonts w:ascii="Consolas" w:hAnsi="Consolas"/>
+              </w:rPr>
+              <w:t xml:space="preserve">reviewer-eval-incentive</w:t>
+            </w:r>
+          </w:p>
+        </w:tc>
+        <w:tc>
+          <w:tcPr>
+            <w:tcW w:w="2340" w:type="dxa"/>
+          </w:tcPr>
+          <w:p>
+            <w:pPr>
+              <w:spacing w:after="0"/>
+            </w:pPr>
+            <w:r>
+              <w:t xml:space="preserve">Yes: name, work email, LinkedIn URL</w:t>
+            </w:r>
+          </w:p>
+        </w:tc>
+        <w:tc>
+          <w:tcPr>
+            <w:tcW w:w="2340" w:type="dxa"/>
+          </w:tcPr>
+          <w:p>
+            <w:pPr>
+              <w:spacing w:after="0"/>
+            </w:pPr>
+            <w:r>
+              <w:t xml:space="preserve">Transferable contact, and the basis for writing the recommendation</w:t>
+            </w:r>
+          </w:p>
+        </w:tc>
+      </w:tr>
+      <w:tr>
+        <w:tc>
+          <w:tcPr>
+            <w:tcW w:w="2340" w:type="dxa"/>
+          </w:tcPr>
+          <w:p>
+            <w:pPr>
+              <w:spacing w:after="0"/>
+            </w:pPr>
+            <w:r>
               <w:t xml:space="preserve">Certificate collected</w:t>
             </w:r>
           </w:p>
@@ -2305,7 +3068,7 @@
         <w:t xml:space="preserve">Nobody has taken the evaluation yet.</w:t>
       </w:r>
       <w:r>
-        <w:t xml:space="preserve"> The baseline is empty by construction; the instrument shipped today.</w:t>
+        <w:t xml:space="preserve"> The baseline reads zero on every funnel metric. The instrument shipped 2026-08-09 and the incentive block and open counter shipped 2026-08-10, so a zero here is the expected state and not a measured result.</w:t>
       </w:r>
     </w:p>
     <w:p>

</xml_diff>

<commit_message>
Move the contact-collection answer to the front of the programme summary
The answer existed but was scattered across three sections a reader had
to assemble. A new opening section states four moments in one table,
with the line that resolves it on its own: answering the nine questions
collects nothing about the respondent.

Adds a four-case outcome list for the tick combinations, answers the
registration question explicitly rather than by absence, and corrects a
heading that said two rows above a table listing three.

Co-Authored-By: Claude Opus 5 <noreply@anthropic.com>
Claude-Session: https://claude.ai/code/session_01W9UtE7X76spacWeSvBH7tv
</commit_message>
<xml_diff>
--- a/research/Reviewer_Program_Summary_2026-08-09.docx
+++ b/research/Reviewer_Program_Summary_2026-08-09.docx
@@ -20,6 +20,499 @@
           <w:b/>
         </w:rPr>
         <w:t xml:space="preserve">Revised 2026-08-10. Live at https://jrsstandard.com/reviewer</w:t>
+      </w:r>
+    </w:p>
+    <w:p>
+      <w:pPr>
+        <w:pBdr>
+          <w:bottom w:val="single" w:sz="6" w:space="1" w:color="AAAAAA"/>
+        </w:pBdr>
+      </w:pPr>
+    </w:p>
+    <w:p>
+      <w:pPr>
+        <w:pStyle w:val="Heading2"/>
+        <w:spacing w:after="140"/>
+      </w:pPr>
+      <w:r>
+        <w:t xml:space="preserve">When contacts get collected</w:t>
+      </w:r>
+    </w:p>
+    <w:p>
+      <w:pPr>
+        <w:spacing w:after="140"/>
+      </w:pPr>
+      <w:r>
+        <w:rPr>
+          <w:b/>
+        </w:rPr>
+        <w:t xml:space="preserve">Four moments. Only four. Everything else in this programme collects nothing about a person.</w:t>
+      </w:r>
+    </w:p>
+    <w:tbl>
+      <w:tblPr>
+        <w:tblStyle w:val="TableGrid"/>
+        <w:tblW w:w="9360" w:type="dxa"/>
+        <w:tblBorders>
+          <w:top w:val="single" w:sz="4" w:space="0" w:color="999999"/>
+          <w:left w:val="single" w:sz="4" w:space="0" w:color="999999"/>
+          <w:bottom w:val="single" w:sz="4" w:space="0" w:color="999999"/>
+          <w:right w:val="single" w:sz="4" w:space="0" w:color="999999"/>
+          <w:insideH w:val="single" w:sz="4" w:space="0" w:color="999999"/>
+          <w:insideV w:val="single" w:sz="4" w:space="0" w:color="999999"/>
+        </w:tblBorders>
+      </w:tblPr>
+      <w:tblGrid>
+        <w:gridCol w:w="2340"/>
+        <w:gridCol w:w="2340"/>
+        <w:gridCol w:w="2340"/>
+        <w:gridCol w:w="2340"/>
+      </w:tblGrid>
+      <w:tr>
+        <w:tc>
+          <w:tcPr>
+            <w:tcW w:w="2340" w:type="dxa"/>
+          </w:tcPr>
+          <w:p>
+            <w:pPr>
+              <w:spacing w:after="0"/>
+            </w:pPr>
+            <w:r>
+              <w:t xml:space="preserve">#</w:t>
+            </w:r>
+          </w:p>
+        </w:tc>
+        <w:tc>
+          <w:tcPr>
+            <w:tcW w:w="2340" w:type="dxa"/>
+          </w:tcPr>
+          <w:p>
+            <w:pPr>
+              <w:spacing w:after="0"/>
+            </w:pPr>
+            <w:r>
+              <w:t xml:space="preserve">Moment</w:t>
+            </w:r>
+          </w:p>
+        </w:tc>
+        <w:tc>
+          <w:tcPr>
+            <w:tcW w:w="2340" w:type="dxa"/>
+          </w:tcPr>
+          <w:p>
+            <w:pPr>
+              <w:spacing w:after="0"/>
+            </w:pPr>
+            <w:r>
+              <w:t xml:space="preserve">What is captured</w:t>
+            </w:r>
+          </w:p>
+        </w:tc>
+        <w:tc>
+          <w:tcPr>
+            <w:tcW w:w="2340" w:type="dxa"/>
+          </w:tcPr>
+          <w:p>
+            <w:pPr>
+              <w:spacing w:after="0"/>
+            </w:pPr>
+            <w:r>
+              <w:t xml:space="preserve">Required?</w:t>
+            </w:r>
+          </w:p>
+        </w:tc>
+      </w:tr>
+      <w:tr>
+        <w:tc>
+          <w:tcPr>
+            <w:tcW w:w="2340" w:type="dxa"/>
+          </w:tcPr>
+          <w:p>
+            <w:pPr>
+              <w:spacing w:after="0"/>
+            </w:pPr>
+            <w:r>
+              <w:t xml:space="preserve">1</w:t>
+            </w:r>
+          </w:p>
+        </w:tc>
+        <w:tc>
+          <w:tcPr>
+            <w:tcW w:w="2340" w:type="dxa"/>
+          </w:tcPr>
+          <w:p>
+            <w:pPr>
+              <w:spacing w:after="0"/>
+            </w:pPr>
+            <w:r>
+              <w:t xml:space="preserve">Registering to unlock modules 2 to 6</w:t>
+            </w:r>
+          </w:p>
+        </w:tc>
+        <w:tc>
+          <w:tcPr>
+            <w:tcW w:w="2340" w:type="dxa"/>
+          </w:tcPr>
+          <w:p>
+            <w:pPr>
+              <w:spacing w:after="0"/>
+            </w:pPr>
+            <w:r>
+              <w:t xml:space="preserve">Name, work email</w:t>
+            </w:r>
+          </w:p>
+        </w:tc>
+        <w:tc>
+          <w:tcPr>
+            <w:tcW w:w="2340" w:type="dxa"/>
+          </w:tcPr>
+          <w:p>
+            <w:pPr>
+              <w:spacing w:after="0"/>
+            </w:pPr>
+            <w:r>
+              <w:t xml:space="preserve">Yes, to see modules 2 to 6. Module 1 needs nothing</w:t>
+            </w:r>
+          </w:p>
+        </w:tc>
+      </w:tr>
+      <w:tr>
+        <w:tc>
+          <w:tcPr>
+            <w:tcW w:w="2340" w:type="dxa"/>
+          </w:tcPr>
+          <w:p>
+            <w:pPr>
+              <w:spacing w:after="0"/>
+            </w:pPr>
+            <w:r>
+              <w:t xml:space="preserve">2</w:t>
+            </w:r>
+          </w:p>
+        </w:tc>
+        <w:tc>
+          <w:tcPr>
+            <w:tcW w:w="2340" w:type="dxa"/>
+          </w:tcPr>
+          <w:p>
+            <w:pPr>
+              <w:spacing w:after="0"/>
+            </w:pPr>
+            <w:r>
+              <w:t xml:space="preserve">Ticking </w:t>
+            </w:r>
+            <w:r>
+              <w:rPr>
+                <w:b/>
+              </w:rPr>
+              <w:t xml:space="preserve">Issue me a certificate</w:t>
+            </w:r>
+            <w:r>
+              <w:t xml:space="preserve"> at the end of the evaluation</w:t>
+            </w:r>
+          </w:p>
+        </w:tc>
+        <w:tc>
+          <w:tcPr>
+            <w:tcW w:w="2340" w:type="dxa"/>
+          </w:tcPr>
+          <w:p>
+            <w:pPr>
+              <w:spacing w:after="0"/>
+            </w:pPr>
+            <w:r>
+              <w:t xml:space="preserve">Name, printed title, work email, organization</w:t>
+            </w:r>
+          </w:p>
+        </w:tc>
+        <w:tc>
+          <w:tcPr>
+            <w:tcW w:w="2340" w:type="dxa"/>
+          </w:tcPr>
+          <w:p>
+            <w:pPr>
+              <w:spacing w:after="0"/>
+            </w:pPr>
+            <w:r>
+              <w:t xml:space="preserve">No. Off by default</w:t>
+            </w:r>
+          </w:p>
+        </w:tc>
+      </w:tr>
+      <w:tr>
+        <w:tc>
+          <w:tcPr>
+            <w:tcW w:w="2340" w:type="dxa"/>
+          </w:tcPr>
+          <w:p>
+            <w:pPr>
+              <w:spacing w:after="0"/>
+            </w:pPr>
+            <w:r>
+              <w:t xml:space="preserve">3</w:t>
+            </w:r>
+          </w:p>
+        </w:tc>
+        <w:tc>
+          <w:tcPr>
+            <w:tcW w:w="2340" w:type="dxa"/>
+          </w:tcPr>
+          <w:p>
+            <w:pPr>
+              <w:spacing w:after="0"/>
+            </w:pPr>
+            <w:r>
+              <w:t xml:space="preserve">Ticking </w:t>
+            </w:r>
+            <w:r>
+              <w:rPr>
+                <w:b/>
+              </w:rPr>
+              <w:t xml:space="preserve">Request a LinkedIn Peer Reviewer Recommendation</w:t>
+            </w:r>
+            <w:r>
+              <w:t xml:space="preserve"> at the end of the evaluation</w:t>
+            </w:r>
+          </w:p>
+        </w:tc>
+        <w:tc>
+          <w:tcPr>
+            <w:tcW w:w="2340" w:type="dxa"/>
+          </w:tcPr>
+          <w:p>
+            <w:pPr>
+              <w:spacing w:after="0"/>
+            </w:pPr>
+            <w:r>
+              <w:t xml:space="preserve">Name, work email, LinkedIn URL</w:t>
+            </w:r>
+          </w:p>
+        </w:tc>
+        <w:tc>
+          <w:tcPr>
+            <w:tcW w:w="2340" w:type="dxa"/>
+          </w:tcPr>
+          <w:p>
+            <w:pPr>
+              <w:spacing w:after="0"/>
+            </w:pPr>
+            <w:r>
+              <w:t xml:space="preserve">No. Off by default</w:t>
+            </w:r>
+          </w:p>
+        </w:tc>
+      </w:tr>
+      <w:tr>
+        <w:tc>
+          <w:tcPr>
+            <w:tcW w:w="2340" w:type="dxa"/>
+          </w:tcPr>
+          <w:p>
+            <w:pPr>
+              <w:spacing w:after="0"/>
+            </w:pPr>
+            <w:r>
+              <w:t xml:space="preserve">4</w:t>
+            </w:r>
+          </w:p>
+        </w:tc>
+        <w:tc>
+          <w:tcPr>
+            <w:tcW w:w="2340" w:type="dxa"/>
+          </w:tcPr>
+          <w:p>
+            <w:pPr>
+              <w:spacing w:after="0"/>
+            </w:pPr>
+            <w:r>
+              <w:t xml:space="preserve">Running the full record check on </w:t>
+            </w:r>
+            <w:r>
+              <w:rPr>
+                <w:rFonts w:ascii="Consolas" w:hAnsi="Consolas"/>
+              </w:rPr>
+              <w:t xml:space="preserve">/pilot</w:t>
+            </w:r>
+          </w:p>
+        </w:tc>
+        <w:tc>
+          <w:tcPr>
+            <w:tcW w:w="2340" w:type="dxa"/>
+          </w:tcPr>
+          <w:p>
+            <w:pPr>
+              <w:spacing w:after="0"/>
+            </w:pPr>
+            <w:r>
+              <w:t xml:space="preserve">Identity carried from the access gate, plus what the diagnostic found</w:t>
+            </w:r>
+          </w:p>
+        </w:tc>
+        <w:tc>
+          <w:tcPr>
+            <w:tcW w:w="2340" w:type="dxa"/>
+          </w:tcPr>
+          <w:p>
+            <w:pPr>
+              <w:spacing w:after="0"/>
+            </w:pPr>
+            <w:r>
+              <w:t xml:space="preserve">No. The one-record test above it asks for nothing</w:t>
+            </w:r>
+          </w:p>
+        </w:tc>
+      </w:tr>
+    </w:tbl>
+    <w:p>
+      <w:pPr/>
+      <w:r>
+        <w:t/>
+      </w:r>
+    </w:p>
+    <w:p>
+      <w:pPr>
+        <w:pStyle w:val="Heading3"/>
+        <w:spacing w:after="140"/>
+      </w:pPr>
+      <w:r>
+        <w:t xml:space="preserve">The single most important line in this document</w:t>
+      </w:r>
+    </w:p>
+    <w:p>
+      <w:pPr>
+        <w:spacing w:after="140"/>
+      </w:pPr>
+      <w:r>
+        <w:rPr>
+          <w:b/>
+        </w:rPr>
+        <w:t xml:space="preserve">Answering the nine questions collects nothing about you.</w:t>
+      </w:r>
+      <w:r>
+        <w:t xml:space="preserve"> A person can open the evaluation, answer all nine, hit submit, and leave no name, no email and no contact record of any kind. That is not an oversight. It is the reason the answers are worth having: question 2 asks whether their own employer has a formal second reader, and a name attached to that answer buys a careful answer instead of a true one.</w:t>
+      </w:r>
+    </w:p>
+    <w:p>
+      <w:pPr>
+        <w:pStyle w:val="Heading3"/>
+        <w:spacing w:after="140"/>
+      </w:pPr>
+      <w:r>
+        <w:t xml:space="preserve">So where do contacts actually come from?</w:t>
+      </w:r>
+    </w:p>
+    <w:p>
+      <w:pPr>
+        <w:spacing w:after="140"/>
+      </w:pPr>
+      <w:r>
+        <w:t xml:space="preserve">Moments 2 and 3 sit side by side on the same screen, both unticked, both at the foot of the evaluation. A respondent can tick neither, either, or both.</w:t>
+      </w:r>
+    </w:p>
+    <w:p>
+      <w:pPr>
+        <w:numPr>
+          <w:ilvl w:val="0"/>
+          <w:numId w:val="1"/>
+        </w:numPr>
+        <w:spacing w:after="60"/>
+      </w:pPr>
+      <w:r>
+        <w:rPr>
+          <w:b/>
+        </w:rPr>
+        <w:t xml:space="preserve">Neither ticked</w:t>
+      </w:r>
+      <w:r>
+        <w:t xml:space="preserve"> → one anonymous answer row. Research value, no contact.</w:t>
+      </w:r>
+    </w:p>
+    <w:p>
+      <w:pPr>
+        <w:numPr>
+          <w:ilvl w:val="0"/>
+          <w:numId w:val="1"/>
+        </w:numPr>
+        <w:spacing w:after="60"/>
+      </w:pPr>
+      <w:r>
+        <w:rPr>
+          <w:b/>
+        </w:rPr>
+        <w:t xml:space="preserve">Certificate ticked</w:t>
+      </w:r>
+      <w:r>
+        <w:t xml:space="preserve"> → answer row, plus a contact row with a completion code.</w:t>
+      </w:r>
+    </w:p>
+    <w:p>
+      <w:pPr>
+        <w:numPr>
+          <w:ilvl w:val="0"/>
+          <w:numId w:val="1"/>
+        </w:numPr>
+        <w:spacing w:after="60"/>
+      </w:pPr>
+      <w:r>
+        <w:rPr>
+          <w:b/>
+        </w:rPr>
+        <w:t xml:space="preserve">Recommendation ticked</w:t>
+      </w:r>
+      <w:r>
+        <w:t xml:space="preserve"> → answer row, plus a contact row with a LinkedIn URL.</w:t>
+      </w:r>
+    </w:p>
+    <w:p>
+      <w:pPr>
+        <w:numPr>
+          <w:ilvl w:val="0"/>
+          <w:numId w:val="1"/>
+        </w:numPr>
+        <w:spacing w:after="60"/>
+      </w:pPr>
+      <w:r>
+        <w:rPr>
+          <w:b/>
+        </w:rPr>
+        <w:t xml:space="preserve">Both ticked</w:t>
+      </w:r>
+      <w:r>
+        <w:t xml:space="preserve"> → answer row, plus </w:t>
+      </w:r>
+      <w:r>
+        <w:rPr>
+          <w:b/>
+        </w:rPr>
+        <w:t xml:space="preserve">two</w:t>
+      </w:r>
+      <w:r>
+        <w:t xml:space="preserve"> contact rows, which is why the funnel counts them separately.</w:t>
+      </w:r>
+    </w:p>
+    <w:p>
+      <w:pPr>
+        <w:spacing w:after="140"/>
+      </w:pPr>
+      <w:r>
+        <w:t xml:space="preserve">The recommendation tick exists because before it, a respondent who did not want a certificate produced a data point and nothing that transfers with the asset.</w:t>
+      </w:r>
+    </w:p>
+    <w:p>
+      <w:pPr>
+        <w:pStyle w:val="Heading3"/>
+        <w:spacing w:after="140"/>
+      </w:pPr>
+      <w:r>
+        <w:t xml:space="preserve">There is no registration link on the evaluation page</w:t>
+      </w:r>
+    </w:p>
+    <w:p>
+      <w:pPr>
+        <w:spacing w:after="140"/>
+      </w:pPr>
+      <w:r>
+        <w:t xml:space="preserve">The evaluation never sends anyone to a gate and never asks anyone to register. The only required tick on that page is consent to anonymous research use of the answers, and it captures no identity.</w:t>
       </w:r>
     </w:p>
     <w:p>
@@ -331,7 +824,7 @@
         <w:spacing w:after="140"/>
       </w:pPr>
       <w:r>
-        <w:t xml:space="preserve">There is also an optional exchange offered at the end of the evaluation, described in the next section, which does not require the training or the certificate.</w:t>
+        <w:t xml:space="preserve">Steps 4 and 5 can be taken without steps 1 to 3. The evaluation is a standalone link, and the two optional contact ticks sit on it.</w:t>
       </w:r>
     </w:p>
     <w:p>
@@ -855,13 +1348,6 @@
     </w:p>
     <w:p>
       <w:pPr>
-        <w:pBdr>
-          <w:bottom w:val="single" w:sz="6" w:space="1" w:color="AAAAAA"/>
-        </w:pBdr>
-      </w:pPr>
-    </w:p>
-    <w:p>
-      <w:pPr>
         <w:pStyle w:val="Heading2"/>
         <w:spacing w:after="140"/>
       </w:pPr>
@@ -1474,7 +1960,7 @@
         <w:spacing w:after="140"/>
       </w:pPr>
       <w:r>
-        <w:t xml:space="preserve">Two unlinked rows: the design decision the whole instrument rests on</w:t>
+        <w:t xml:space="preserve">Three unlinked rows: the design decision the whole instrument rests on</w:t>
       </w:r>
     </w:p>
     <w:p>

</xml_diff>

<commit_message>
Document country tracking in the summary and record it
Co-Authored-By: Claude Opus 5 <noreply@anthropic.com>
Claude-Session: https://claude.ai/code/session_01W9UtE7X76spacWeSvBH7tv
</commit_message>
<xml_diff>
--- a/research/Reviewer_Program_Summary_2026-08-09.docx
+++ b/research/Reviewer_Program_Summary_2026-08-09.docx
@@ -1478,15 +1478,15 @@
         <w:spacing w:after="140"/>
       </w:pPr>
       <w:r>
-        <w:t xml:space="preserve">Measurement: opened, submitted, completed, captured</w:t>
-      </w:r>
-    </w:p>
-    <w:p>
-      <w:pPr>
-        <w:spacing w:after="140"/>
-      </w:pPr>
-      <w:r>
-        <w:t xml:space="preserve">Four numbers, answering four different questions that were previously collapsed into one. All live at </w:t>
+        <w:t xml:space="preserve">Measurement: opened, submitted, completed, captured, and from where</w:t>
+      </w:r>
+    </w:p>
+    <w:p>
+      <w:pPr>
+        <w:spacing w:after="140"/>
+      </w:pPr>
+      <w:r>
+        <w:t xml:space="preserve">Five things, answering five different questions that were previously collapsed into one. All live at </w:t>
       </w:r>
       <w:r>
         <w:rPr>
@@ -1862,11 +1862,177 @@
           </w:p>
         </w:tc>
       </w:tr>
+      <w:tr>
+        <w:tc>
+          <w:tcPr>
+            <w:tcW w:w="4680" w:type="dxa"/>
+          </w:tcPr>
+          <w:p>
+            <w:pPr>
+              <w:spacing w:after="0"/>
+            </w:pPr>
+            <w:r>
+              <w:rPr>
+                <w:rFonts w:ascii="Consolas" w:hAnsi="Consolas"/>
+              </w:rPr>
+              <w:t xml:space="preserve">countries_opened</w:t>
+            </w:r>
+          </w:p>
+        </w:tc>
+        <w:tc>
+          <w:tcPr>
+            <w:tcW w:w="4680" w:type="dxa"/>
+          </w:tcPr>
+          <w:p>
+            <w:pPr>
+              <w:spacing w:after="0"/>
+            </w:pPr>
+            <w:r>
+              <w:t xml:space="preserve">Country of reviewer at the open stage, counts per country</w:t>
+            </w:r>
+          </w:p>
+        </w:tc>
+      </w:tr>
+      <w:tr>
+        <w:tc>
+          <w:tcPr>
+            <w:tcW w:w="4680" w:type="dxa"/>
+          </w:tcPr>
+          <w:p>
+            <w:pPr>
+              <w:spacing w:after="0"/>
+            </w:pPr>
+            <w:r>
+              <w:rPr>
+                <w:rFonts w:ascii="Consolas" w:hAnsi="Consolas"/>
+              </w:rPr>
+              <w:t xml:space="preserve">countries_submitted</w:t>
+            </w:r>
+          </w:p>
+        </w:tc>
+        <w:tc>
+          <w:tcPr>
+            <w:tcW w:w="4680" w:type="dxa"/>
+          </w:tcPr>
+          <w:p>
+            <w:pPr>
+              <w:spacing w:after="0"/>
+            </w:pPr>
+            <w:r>
+              <w:t xml:space="preserve">Country of reviewer at the submission stage</w:t>
+            </w:r>
+          </w:p>
+        </w:tc>
+      </w:tr>
+      <w:tr>
+        <w:tc>
+          <w:tcPr>
+            <w:tcW w:w="4680" w:type="dxa"/>
+          </w:tcPr>
+          <w:p>
+            <w:pPr>
+              <w:spacing w:after="0"/>
+            </w:pPr>
+            <w:r>
+              <w:rPr>
+                <w:rFonts w:ascii="Consolas" w:hAnsi="Consolas"/>
+              </w:rPr>
+              <w:t xml:space="preserve">countries_contacts</w:t>
+            </w:r>
+          </w:p>
+        </w:tc>
+        <w:tc>
+          <w:tcPr>
+            <w:tcW w:w="4680" w:type="dxa"/>
+          </w:tcPr>
+          <w:p>
+            <w:pPr>
+              <w:spacing w:after="0"/>
+            </w:pPr>
+            <w:r>
+              <w:t xml:space="preserve">Country of reviewer for the contacts captured</w:t>
+            </w:r>
+          </w:p>
+        </w:tc>
+      </w:tr>
+      <w:tr>
+        <w:tc>
+          <w:tcPr>
+            <w:tcW w:w="4680" w:type="dxa"/>
+          </w:tcPr>
+          <w:p>
+            <w:pPr>
+              <w:spacing w:after="0"/>
+            </w:pPr>
+            <w:r>
+              <w:rPr>
+                <w:rFonts w:ascii="Consolas" w:hAnsi="Consolas"/>
+              </w:rPr>
+              <w:t xml:space="preserve">distinct_countries_opened</w:t>
+            </w:r>
+          </w:p>
+        </w:tc>
+        <w:tc>
+          <w:tcPr>
+            <w:tcW w:w="4680" w:type="dxa"/>
+          </w:tcPr>
+          <w:p>
+            <w:pPr>
+              <w:spacing w:after="0"/>
+            </w:pPr>
+            <w:r>
+              <w:t xml:space="preserve">How many countries the instrument has reached</w:t>
+            </w:r>
+          </w:p>
+        </w:tc>
+      </w:tr>
     </w:tbl>
     <w:p>
       <w:pPr/>
       <w:r>
         <w:t/>
+      </w:r>
+    </w:p>
+    <w:p>
+      <w:pPr>
+        <w:spacing w:after="140"/>
+      </w:pPr>
+      <w:r>
+        <w:rPr>
+          <w:b/>
+        </w:rPr>
+        <w:t xml:space="preserve">Country of reviewer is tracked at every stage.</w:t>
+      </w:r>
+      <w:r>
+        <w:t xml:space="preserve"> The two-letter code has been written on all four row types from the edge since they were built and was surfaced on 2026-08-10. Opens, submissions and contacts are reported side by side per country, because a country that opens and never submits is a different signal from one that converts, and a single total hides both.</w:t>
+      </w:r>
+    </w:p>
+    <w:p>
+      <w:pPr>
+        <w:spacing w:after="140"/>
+      </w:pPr>
+      <w:r>
+        <w:rPr>
+          <w:b/>
+        </w:rPr>
+        <w:t xml:space="preserve">Answers are deliberately not broken down by country.</w:t>
+      </w:r>
+      <w:r>
+        <w:t xml:space="preserve"> With a handful of responses, "the one respondent from Iceland says their employer has no second reader" is a re-identification, and the whole instrument depends on that being impossible. Counts per country, never answers per country.</w:t>
+      </w:r>
+    </w:p>
+    <w:p>
+      <w:pPr>
+        <w:spacing w:after="140"/>
+      </w:pPr>
+      <w:r>
+        <w:rPr>
+          <w:b/>
+        </w:rPr>
+        <w:t xml:space="preserve">Where a reviewer sits is not necessarily where their employer is.</w:t>
+      </w:r>
+      <w:r>
+        <w:t xml:space="preserve"> The code comes from the network edge at the moment of the request, so it reports the reader's location and not the organization's.</w:t>
       </w:r>
     </w:p>
     <w:p>

</xml_diff>